<commit_message>
docs: HTTPS live + consolidated API key setup
- README/SERVER_SETUP/manual.docx: mark HTTPS as live (ICT cert mounted in
  didata-nginx via /var/web_server/htdocs/didata/docker-compose.yml), switch
  URLs to https, document the cert-mount/recreate vs config/reload split
- add a single generate → configure (.env) → use (dashboard) API key guide,
  with the open-mode warning when API_KEY is unset
- deploy/nginx/mude-monitoring.conf: live 443 block with real cert paths
</commit_message>
<xml_diff>
--- a/docs/MUDE_Monitoring_Server_Manual.docx
+++ b/docs/MUDE_Monitoring_Server_Manual.docx
@@ -307,7 +307,7 @@
                 <w:sz w:val="19"/>
                 <w:szCs w:val="19"/>
               </w:rPr>
-              <w:t xml:space="preserve">http://mude-monitoring.citg.tudelft.nl  (HTTPS pending ICT cert)</w:t>
+              <w:t xml:space="preserve">https://mude-monitoring.citg.tudelft.nl</w:t>
             </w:r>
           </w:p>
         </w:tc>
@@ -1286,7 +1286,22 @@
           <w:sz w:val="18"/>
           <w:szCs w:val="18"/>
         </w:rPr>
-        <w:t xml:space="preserve"># Sender / recipients (REQUIRED - no mail without ALERT_EMAIL_TO; comma-separated)</w:t>
+        <w:t xml:space="preserve"># Sender. Recipients are managed in backend/recipients.txt (one per line);</w:t>
+      </w:r>
+    </w:p>
+    <w:p>
+      <w:pPr>
+        <w:shd w:fill="F2F2F2" w:color="auto" w:val="clear"/>
+        <w:spacing w:after="0" w:line="252"/>
+        <w:ind w:left="120" w:right="120"/>
+      </w:pPr>
+      <w:r>
+        <w:rPr>
+          <w:rFonts w:ascii="Consolas" w:cs="Consolas" w:eastAsia="Consolas" w:hAnsi="Consolas"/>
+          <w:sz w:val="18"/>
+          <w:szCs w:val="18"/>
+        </w:rPr>
+        <w:t xml:space="preserve"># ALERT_EMAIL_TO is only a fallback when that file is missing/empty.</w:t>
       </w:r>
     </w:p>
     <w:p>
@@ -1346,37 +1361,37 @@
           <w:sz w:val="18"/>
           <w:szCs w:val="18"/>
         </w:rPr>
-        <w:t xml:space="preserve"># Use http:// while HTTP-only; switch to https:// after TLS (section 6)</w:t>
-      </w:r>
-    </w:p>
-    <w:p>
-      <w:pPr>
-        <w:shd w:fill="F2F2F2" w:color="auto" w:val="clear"/>
-        <w:spacing w:after="0" w:line="252"/>
-        <w:ind w:left="120" w:right="120"/>
-      </w:pPr>
-      <w:r>
-        <w:rPr>
-          <w:rFonts w:ascii="Consolas" w:cs="Consolas" w:eastAsia="Consolas" w:hAnsi="Consolas"/>
-          <w:sz w:val="18"/>
-          <w:szCs w:val="18"/>
-        </w:rPr>
-        <w:t xml:space="preserve">PUBLIC_URL=http://mude-monitoring.citg.tudelft.nl</w:t>
-      </w:r>
-    </w:p>
-    <w:p>
-      <w:pPr>
-        <w:shd w:fill="F2F2F2" w:color="auto" w:val="clear"/>
-        <w:spacing w:after="0" w:line="252"/>
-        <w:ind w:left="120" w:right="120"/>
-      </w:pPr>
-      <w:r>
-        <w:rPr>
-          <w:rFonts w:ascii="Consolas" w:cs="Consolas" w:eastAsia="Consolas" w:hAnsi="Consolas"/>
-          <w:sz w:val="18"/>
-          <w:szCs w:val="18"/>
-        </w:rPr>
-        <w:t xml:space="preserve">ALLOWED_ORIGINS=http://mude-monitoring.citg.tudelft.nl</w:t>
+        <w:t xml:space="preserve"># HTTPS is live - scheme must match how users connect</w:t>
+      </w:r>
+    </w:p>
+    <w:p>
+      <w:pPr>
+        <w:shd w:fill="F2F2F2" w:color="auto" w:val="clear"/>
+        <w:spacing w:after="0" w:line="252"/>
+        <w:ind w:left="120" w:right="120"/>
+      </w:pPr>
+      <w:r>
+        <w:rPr>
+          <w:rFonts w:ascii="Consolas" w:cs="Consolas" w:eastAsia="Consolas" w:hAnsi="Consolas"/>
+          <w:sz w:val="18"/>
+          <w:szCs w:val="18"/>
+        </w:rPr>
+        <w:t xml:space="preserve">PUBLIC_URL=https://mude-monitoring.citg.tudelft.nl</w:t>
+      </w:r>
+    </w:p>
+    <w:p>
+      <w:pPr>
+        <w:shd w:fill="F2F2F2" w:color="auto" w:val="clear"/>
+        <w:spacing w:after="0" w:line="252"/>
+        <w:ind w:left="120" w:right="120"/>
+      </w:pPr>
+      <w:r>
+        <w:rPr>
+          <w:rFonts w:ascii="Consolas" w:cs="Consolas" w:eastAsia="Consolas" w:hAnsi="Consolas"/>
+          <w:sz w:val="18"/>
+          <w:szCs w:val="18"/>
+        </w:rPr>
+        <w:t xml:space="preserve">ALLOWED_ORIGINS=https://mude-monitoring.citg.tudelft.nl</w:t>
       </w:r>
     </w:p>
     <w:p>
@@ -1438,6 +1453,93 @@
       </w:r>
       <w:r>
         <w:t xml:space="preserve">only port 25 is reachable from edu01 (587/465 are firewalled). A scheme mismatch between ALLOWED_ORIGINS and how users connect causes CORS failures on admin add/delete.</w:t>
+      </w:r>
+    </w:p>
+    <w:p>
+      <w:pPr>
+        <w:pStyle w:val="Heading2"/>
+      </w:pPr>
+      <w:r>
+        <w:t xml:space="preserve">API key (admin write access)</w:t>
+      </w:r>
+    </w:p>
+    <w:p>
+      <w:pPr>
+        <w:spacing w:after="120" w:line="276"/>
+      </w:pPr>
+      <w:r>
+        <w:t xml:space="preserve">Reading the dashboard and status page needs no key — it only gates adding/deleting monitored targets. One shared key, stored in .env. Generate one, set it, restart:</w:t>
+      </w:r>
+    </w:p>
+    <w:p>
+      <w:pPr>
+        <w:shd w:fill="F2F2F2" w:color="auto" w:val="clear"/>
+        <w:spacing w:after="0" w:line="252"/>
+        <w:ind w:left="120" w:right="120"/>
+      </w:pPr>
+      <w:r>
+        <w:rPr>
+          <w:rFonts w:ascii="Consolas" w:cs="Consolas" w:eastAsia="Consolas" w:hAnsi="Consolas"/>
+          <w:sz w:val="18"/>
+          <w:szCs w:val="18"/>
+        </w:rPr>
+        <w:t xml:space="preserve">openssl rand -hex 32                 # 1. generate</w:t>
+      </w:r>
+    </w:p>
+    <w:p>
+      <w:pPr>
+        <w:shd w:fill="F2F2F2" w:color="auto" w:val="clear"/>
+        <w:spacing w:after="0" w:line="252"/>
+        <w:ind w:left="120" w:right="120"/>
+      </w:pPr>
+      <w:r>
+        <w:rPr>
+          <w:rFonts w:ascii="Consolas" w:cs="Consolas" w:eastAsia="Consolas" w:hAnsi="Consolas"/>
+          <w:sz w:val="18"/>
+          <w:szCs w:val="18"/>
+        </w:rPr>
+        <w:t xml:space="preserve">nano .env                            # 2. set API_KEY=&lt;the value&gt;</w:t>
+      </w:r>
+    </w:p>
+    <w:p>
+      <w:pPr>
+        <w:shd w:fill="F2F2F2" w:color="auto" w:val="clear"/>
+        <w:spacing w:after="160" w:line="252"/>
+        <w:ind w:left="120" w:right="120"/>
+      </w:pPr>
+      <w:r>
+        <w:rPr>
+          <w:rFonts w:ascii="Consolas" w:cs="Consolas" w:eastAsia="Consolas" w:hAnsi="Consolas"/>
+          <w:sz w:val="18"/>
+          <w:szCs w:val="18"/>
+        </w:rPr>
+        <w:t xml:space="preserve">docker compose up -d                 # 3. restart so the backend picks it up</w:t>
+      </w:r>
+    </w:p>
+    <w:p>
+      <w:pPr>
+        <w:spacing w:after="120" w:line="276"/>
+      </w:pPr>
+      <w:r>
+        <w:t xml:space="preserve">Each admin then enters the same value once in the browser: open the dashboard, click </w:t>
+      </w:r>
+      <w:r>
+        <w:rPr>
+          <w:b/>
+          <w:bCs/>
+        </w:rPr>
+        <w:t xml:space="preserve">Set API key</w:t>
+      </w:r>
+      <w:r>
+        <w:t xml:space="preserve">, paste it, Save (stored in that browser only, sent as the X-Api-Key header). </w:t>
+      </w:r>
+      <w:r>
+        <w:rPr>
+          <w:b/>
+          <w:bCs/>
+          <w:color w:val="C00000"/>
+        </w:rPr>
+        <w:t xml:space="preserve">If API_KEY is empty, the backend runs in open mode — anyone can add/delete targets, so always set one in production.</w:t>
       </w:r>
     </w:p>
     <w:p>
@@ -1936,7 +2038,7 @@
         <w:pStyle w:val="Heading1"/>
       </w:pPr>
       <w:r>
-        <w:t xml:space="preserve">6. HTTPS</w:t>
+        <w:t xml:space="preserve">6. HTTPS (live — ICT-issued cert)</w:t>
       </w:r>
     </w:p>
     <w:p>
@@ -1944,7 +2046,56 @@
         <w:spacing w:after="120" w:line="276"/>
       </w:pPr>
       <w:r>
-        <w:t xml:space="preserve">Let's Encrypt / certbot is not used here. Request a certificate for mude-monitoring.citg.tudelft.nl from TU Delft ICT (DNS CNAME is already set). When it arrives:</w:t>
+        <w:t xml:space="preserve">Let's Encrypt / certbot is not used. TU Delft ICT issued and auto-renews the certificate (renewal hook runs </w:t>
+      </w:r>
+      <w:r>
+        <w:rPr>
+          <w:rFonts w:ascii="Consolas" w:cs="Consolas" w:eastAsia="Consolas" w:hAnsi="Consolas"/>
+          <w:sz w:val="19"/>
+          <w:szCs w:val="19"/>
+        </w:rPr>
+        <w:t xml:space="preserve">docker restart didata-nginx-1</w:t>
+      </w:r>
+      <w:r>
+        <w:t xml:space="preserve">). Cert/key on the host:</w:t>
+      </w:r>
+    </w:p>
+    <w:p>
+      <w:pPr>
+        <w:shd w:fill="F2F2F2" w:color="auto" w:val="clear"/>
+        <w:spacing w:after="0" w:line="252"/>
+        <w:ind w:left="120" w:right="120"/>
+      </w:pPr>
+      <w:r>
+        <w:rPr>
+          <w:rFonts w:ascii="Consolas" w:cs="Consolas" w:eastAsia="Consolas" w:hAnsi="Consolas"/>
+          <w:sz w:val="18"/>
+          <w:szCs w:val="18"/>
+        </w:rPr>
+        <w:t xml:space="preserve">/etc/ssl/certs/mude-monitoring.citg.tudelft.nl.crt</w:t>
+      </w:r>
+    </w:p>
+    <w:p>
+      <w:pPr>
+        <w:shd w:fill="F2F2F2" w:color="auto" w:val="clear"/>
+        <w:spacing w:after="160" w:line="252"/>
+        <w:ind w:left="120" w:right="120"/>
+      </w:pPr>
+      <w:r>
+        <w:rPr>
+          <w:rFonts w:ascii="Consolas" w:cs="Consolas" w:eastAsia="Consolas" w:hAnsi="Consolas"/>
+          <w:sz w:val="18"/>
+          <w:szCs w:val="18"/>
+        </w:rPr>
+        <w:t xml:space="preserve">/etc/ssl/private/mude-monitoring.citg.tudelft.nl.key</w:t>
+      </w:r>
+    </w:p>
+    <w:p>
+      <w:pPr>
+        <w:spacing w:after="120" w:line="276"/>
+      </w:pPr>
+      <w:r>
+        <w:t xml:space="preserve">How it was wired up (for rebuilds): mount the cert/key into didata-nginx via the compose that actually created it, then switch the proxy block to HTTPS.</w:t>
       </w:r>
     </w:p>
     <w:p>
@@ -1957,17 +2108,63 @@
         <w:spacing w:after="80" w:line="264"/>
       </w:pPr>
       <w:r>
-        <w:t xml:space="preserve">Place cert + key on the host and add bind mounts to the </w:t>
-      </w:r>
-      <w:r>
-        <w:rPr>
-          <w:i/>
-          <w:iCs/>
-        </w:rPr>
-        <w:t xml:space="preserve">didata</w:t>
-      </w:r>
-      <w:r>
-        <w:t xml:space="preserve"> compose service (same pattern as the existing edu01 cert/key mounts); recreate didata-nginx.</w:t>
+        <w:t xml:space="preserve">Add two single-file :ro mounts (like the edu01 cert) to the nginx service of </w:t>
+      </w:r>
+      <w:r>
+        <w:rPr>
+          <w:rFonts w:ascii="Consolas" w:cs="Consolas" w:eastAsia="Consolas" w:hAnsi="Consolas"/>
+          <w:sz w:val="19"/>
+          <w:szCs w:val="19"/>
+        </w:rPr>
+        <w:t xml:space="preserve">/var/web_server/htdocs/didata/docker-compose.yml</w:t>
+      </w:r>
+      <w:r>
+        <w:t xml:space="preserve">, then recreate nginx:</w:t>
+      </w:r>
+    </w:p>
+    <w:p>
+      <w:pPr>
+        <w:shd w:fill="F2F2F2" w:color="auto" w:val="clear"/>
+        <w:spacing w:after="0" w:line="252"/>
+        <w:ind w:left="120" w:right="120"/>
+      </w:pPr>
+      <w:r>
+        <w:rPr>
+          <w:rFonts w:ascii="Consolas" w:cs="Consolas" w:eastAsia="Consolas" w:hAnsi="Consolas"/>
+          <w:sz w:val="18"/>
+          <w:szCs w:val="18"/>
+        </w:rPr>
+        <w:t xml:space="preserve">cd /var/web_server/htdocs/didata</w:t>
+      </w:r>
+    </w:p>
+    <w:p>
+      <w:pPr>
+        <w:shd w:fill="F2F2F2" w:color="auto" w:val="clear"/>
+        <w:spacing w:after="0" w:line="252"/>
+        <w:ind w:left="120" w:right="120"/>
+      </w:pPr>
+      <w:r>
+        <w:rPr>
+          <w:rFonts w:ascii="Consolas" w:cs="Consolas" w:eastAsia="Consolas" w:hAnsi="Consolas"/>
+          <w:sz w:val="18"/>
+          <w:szCs w:val="18"/>
+        </w:rPr>
+        <w:t xml:space="preserve">sudo docker compose config &gt;/dev/null &amp;&amp; sudo docker compose up -d nginx</w:t>
+      </w:r>
+    </w:p>
+    <w:p>
+      <w:pPr>
+        <w:shd w:fill="F2F2F2" w:color="auto" w:val="clear"/>
+        <w:spacing w:after="160" w:line="252"/>
+        <w:ind w:left="120" w:right="120"/>
+      </w:pPr>
+      <w:r>
+        <w:rPr>
+          <w:rFonts w:ascii="Consolas" w:cs="Consolas" w:eastAsia="Consolas" w:hAnsi="Consolas"/>
+          <w:sz w:val="18"/>
+          <w:szCs w:val="18"/>
+        </w:rPr>
+        <w:t xml:space="preserve">sudo docker exec didata-nginx-1 ls -l /etc/ssl/certs/mude-monitoring.citg.tudelft.nl.crt</w:t>
       </w:r>
     </w:p>
     <w:p>
@@ -1980,7 +2177,7 @@
         <w:spacing w:after="80" w:line="264"/>
       </w:pPr>
       <w:r>
-        <w:t xml:space="preserve">Replace the HTTP block with the HTTPS variant (commented in </w:t>
+        <w:t xml:space="preserve">Switch the proxy block in default.conf to the HTTPS variant (:80 → 301 + :443 ssl) from </w:t>
       </w:r>
       <w:r>
         <w:rPr>
@@ -1991,50 +2188,22 @@
         <w:t xml:space="preserve">deploy/nginx/mude-monitoring.conf</w:t>
       </w:r>
       <w:r>
-        <w:t xml:space="preserve">): an :80 → 301 redirect plus an :443 ssl block.</w:t>
-      </w:r>
-    </w:p>
-    <w:p>
-      <w:pPr>
-        <w:pStyle w:val="ListParagraph"/>
-        <w:numPr>
-          <w:ilvl w:val="0"/>
-          <w:numId w:val="3"/>
-        </w:numPr>
-        <w:spacing w:after="80" w:line="264"/>
-      </w:pPr>
-      <w:r>
-        <w:t xml:space="preserve">Reload didata-nginx, then flip .env back to HTTPS and restart our stack:</w:t>
-      </w:r>
-    </w:p>
-    <w:p>
-      <w:pPr>
-        <w:shd w:fill="F2F2F2" w:color="auto" w:val="clear"/>
-        <w:spacing w:after="0" w:line="252"/>
-        <w:ind w:left="120" w:right="120"/>
-      </w:pPr>
-      <w:r>
-        <w:rPr>
-          <w:rFonts w:ascii="Consolas" w:cs="Consolas" w:eastAsia="Consolas" w:hAnsi="Consolas"/>
-          <w:sz w:val="18"/>
-          <w:szCs w:val="18"/>
-        </w:rPr>
-        <w:t xml:space="preserve">sed -i 's|PUBLIC_URL=.*|PUBLIC_URL=https://mude-monitoring.citg.tudelft.nl|' .env</w:t>
-      </w:r>
-    </w:p>
-    <w:p>
-      <w:pPr>
-        <w:shd w:fill="F2F2F2" w:color="auto" w:val="clear"/>
-        <w:spacing w:after="0" w:line="252"/>
-        <w:ind w:left="120" w:right="120"/>
-      </w:pPr>
-      <w:r>
-        <w:rPr>
-          <w:rFonts w:ascii="Consolas" w:cs="Consolas" w:eastAsia="Consolas" w:hAnsi="Consolas"/>
-          <w:sz w:val="18"/>
-          <w:szCs w:val="18"/>
-        </w:rPr>
-        <w:t xml:space="preserve">sed -i 's|ALLOWED_ORIGINS=.*|ALLOWED_ORIGINS=https://mude-monitoring.citg.tudelft.nl|' .env</w:t>
+        <w:t xml:space="preserve">, then validate + reload (zero-downtime):</w:t>
+      </w:r>
+    </w:p>
+    <w:p>
+      <w:pPr>
+        <w:shd w:fill="F2F2F2" w:color="auto" w:val="clear"/>
+        <w:spacing w:after="0" w:line="252"/>
+        <w:ind w:left="120" w:right="120"/>
+      </w:pPr>
+      <w:r>
+        <w:rPr>
+          <w:rFonts w:ascii="Consolas" w:cs="Consolas" w:eastAsia="Consolas" w:hAnsi="Consolas"/>
+          <w:sz w:val="18"/>
+          <w:szCs w:val="18"/>
+        </w:rPr>
+        <w:t xml:space="preserve">sudo docker exec didata-nginx-1 nginx -t</w:t>
       </w:r>
     </w:p>
     <w:p>
@@ -2049,7 +2218,22 @@
           <w:sz w:val="18"/>
           <w:szCs w:val="18"/>
         </w:rPr>
-        <w:t xml:space="preserve">docker compose up -d</w:t>
+        <w:t xml:space="preserve">sudo docker exec didata-nginx-1 nginx -s reload</w:t>
+      </w:r>
+    </w:p>
+    <w:p>
+      <w:pPr>
+        <w:spacing w:after="120" w:line="276"/>
+      </w:pPr>
+      <w:r>
+        <w:rPr>
+          <w:b/>
+          <w:bCs/>
+        </w:rPr>
+        <w:t xml:space="preserve">Do the mount (recreate) and the config change (reload) as separate steps: </w:t>
+      </w:r>
+      <w:r>
+        <w:t xml:space="preserve">a bad default.conf fails nginx -t so reload is refused (no downtime), whereas a broken recreate can take didata down. .env already uses https://, so no app change is needed.</w:t>
       </w:r>
     </w:p>
     <w:p>
@@ -3450,7 +3634,7 @@
           <w:sz w:val="18"/>
           <w:szCs w:val="18"/>
         </w:rPr>
-        <w:t xml:space="preserve">curl -I  http://mude-monitoring.citg.tudelft.nl</w:t>
+        <w:t xml:space="preserve">curl -I  https://mude-monitoring.citg.tudelft.nl</w:t>
       </w:r>
     </w:p>
     <w:sectPr>

</xml_diff>